<commit_message>
Synthese en Overzicht v1.2a: cijfers in lijn met tweede lezing rondes 5b/6
- §4.12: CAW gevangenis 164 wachtenden (juni 2023) plus 45 ingeplande gesprekken Oost-Vlaanderen
- §4.12: VAPH-projecten 2,1 mln in 2023, vóór uitbreiding mei 2024
- §3.2, §8, kerncijfers: 436 cijfers / 372 dubbel gelezen / 34 één keer gelezen; controlekolom bijgewerkt
- Overzicht: tellingen en kalender bijgewerkt, 'tweede lezing' uit de nog-aan-te-vullen cellen

Co-Authored-By: Claude Fable 5.1 <noreply@anthropic.com>
Claude-Session: https://claude.ai/code/session_015NSunMLHkxfSG4sNUpSCHf
</commit_message>
<xml_diff>
--- a/docs/Overzicht_voorzieningen_werkvoorraad_v1.2_2026-10-01.docx
+++ b/docs/Overzicht_voorzieningen_werkvoorraad_v1.2_2026-10-01.docx
@@ -29,7 +29,7 @@
           <w:sz w:val="22"/>
           <w:szCs w:val="22"/>
         </w:rPr>
-        <w:t xml:space="preserve">Stand 1 oktober 2026, versie 1.2 (inventaris volledig) · bijlage bij het synthesedocument v1.2 · 26 voorzieningen in de inventaris</w:t>
+        <w:t xml:space="preserve">Stand 1 oktober 2026, versie 1.2a (inventaris volledig, na tweede lezing rondes 5b/6) · bijlage bij het synthesedocument v1.2a · 26 voorzieningen in de inventaris</w:t>
       </w:r>
     </w:p>
     <w:p>
@@ -196,7 +196,7 @@
           <w:sz w:val="21"/>
           <w:szCs w:val="21"/>
         </w:rPr>
-        <w:t xml:space="preserve">: 425 cijfers (313 dubbel gelezen, 82 één keer gelezen uit de rondes 5b en 6, 24 ongecontroleerd, 6 betwist), 144 bronnen, 86 budgetrijen, 3.958 kredietrijen uit de begrotingsstukken.</w:t>
+        <w:t xml:space="preserve">: 436 cijfers (372 dubbel gelezen, 34 één keer gelezen, 24 ongecontroleerd, 6 betwist), 144 bronnen, 86 budgetrijen, 3.958 kredietrijen uit de begrotingsstukken.</w:t>
       </w:r>
     </w:p>
     <w:p>
@@ -226,7 +226,7 @@
           <w:sz w:val="21"/>
           <w:szCs w:val="21"/>
         </w:rPr>
-        <w:t xml:space="preserve"> verschuift van uitbreiden naar onderhouden: de jaarkalender uit het draaiboek (VAPH juni/oktober, Wonen en Opgroeien juni–juli, begroting mei en oktober, SV-reeksen januari–maart), de tweede lezing van 82 cijfers, en de opvolging van de aangekondigde monitoringssystemen (GGZ, diagnostiek, buitengewoon onderwijs) die nieuwe reeksen kunnen opleveren.</w:t>
+        <w:t xml:space="preserve"> verschuift van uitbreiden naar onderhouden: de jaarkalender uit het draaiboek (VAPH juni/oktober, Wonen en Opgroeien juni–juli, begroting mei en oktober, SV-reeksen januari–maart), de tweede lezing van de laatste 34 cijfers, en de opvolging van de aangekondigde monitoringssystemen (GGZ, diagnostiek, buitengewoon onderwijs) die nieuwe reeksen kunnen opleveren.</w:t>
       </w:r>
     </w:p>
     <w:p>
@@ -3355,7 +3355,7 @@
                 <w:sz w:val="18"/>
                 <w:szCs w:val="18"/>
               </w:rPr>
-              <w:t xml:space="preserve">tweede lezing 2025; cijfers op maat jaarlijks</w:t>
+              <w:t xml:space="preserve">cijfers op maat jaarlijks</w:t>
             </w:r>
           </w:p>
         </w:tc>
@@ -3559,7 +3559,7 @@
                 <w:sz w:val="18"/>
                 <w:szCs w:val="18"/>
               </w:rPr>
-              <w:t xml:space="preserve">tweede lezing; VAPH-jaarverslag juni</w:t>
+              <w:t xml:space="preserve">VAPH-jaarverslag juni</w:t>
             </w:r>
           </w:p>
         </w:tc>
@@ -4171,7 +4171,7 @@
                 <w:sz w:val="18"/>
                 <w:szCs w:val="18"/>
               </w:rPr>
-              <w:t xml:space="preserve">forensische VAPH-units; tweede lezing</w:t>
+              <w:t xml:space="preserve">forensische VAPH-units</w:t>
             </w:r>
           </w:p>
         </w:tc>
@@ -5329,7 +5329,7 @@
                 <w:sz w:val="17"/>
                 <w:szCs w:val="17"/>
               </w:rPr>
-              <w:t xml:space="preserve">tweede lezing van 82 cijfers (rondes 5b en 6); nieuwe SV's over wachttijden</w:t>
+              <w:t xml:space="preserve">tweede lezing van 34 resterende cijfers; nieuwe SV's over wachttijden</w:t>
             </w:r>
           </w:p>
         </w:tc>

</xml_diff>